<commit_message>
Analytics: ajustes em fontes, segmentos, export S3 e infraestrutura
Seção 2: assinaturas Clube iFood passam a ser responsabilidade exclusiva do iFood;
remove linha de status Clube iFood. Seção 6.2: texto atualizado para export via S3 AWS.
Seção 6.3 removida. Seção 8.1: remove campo Acesso dos dashboards. Seção 8.2:
simplificada para Formato (S3 AWS) e Frequência. Seção 8.3 (webhooks) removida.

Co-Authored-By: Claude Sonnet 4.6 <noreply@anthropic.com>
</commit_message>
<xml_diff>
--- a/Dados e Métricas/Dados e Métricas - Bolão Copa do Mundo FIFA 2026 CazéTV.docx
+++ b/Dados e Métricas/Dados e Métricas - Bolão Copa do Mundo FIFA 2026 CazéTV.docx
@@ -800,7 +800,7 @@
                 <w:b w:val="0"/>
                 <w:i w:val="0"/>
               </w:rPr>
-              <w:t>iFood + LiveLike</w:t>
+              <w:t>iFood</w:t>
             </w:r>
           </w:p>
         </w:tc>
@@ -818,63 +818,7 @@
                 <w:b w:val="0"/>
                 <w:i w:val="0"/>
               </w:rPr>
-              <w:t>Ambos (reconciliação)</w:t>
-            </w:r>
-          </w:p>
-        </w:tc>
-      </w:tr>
-      <w:tr>
-        <w:tc>
-          <w:tcPr>
-            <w:tcW w:type="dxa" w:w="2946"/>
-          </w:tcPr>
-          <w:p>
-            <w:pPr>
-              <w:spacing w:after="40"/>
-            </w:pPr>
-            <w:r/>
-            <w:r>
-              <w:rPr>
-                <w:b w:val="0"/>
-                <w:i w:val="0"/>
-              </w:rPr>
-              <w:t>Status Clube iFood por usuário</w:t>
-            </w:r>
-          </w:p>
-        </w:tc>
-        <w:tc>
-          <w:tcPr>
-            <w:tcW w:type="dxa" w:w="2946"/>
-          </w:tcPr>
-          <w:p>
-            <w:pPr>
-              <w:spacing w:after="40"/>
-            </w:pPr>
-            <w:r/>
-            <w:r>
-              <w:rPr>
-                <w:b w:val="0"/>
-                <w:i w:val="0"/>
-              </w:rPr>
-              <w:t>iFood → LiveLike via SSO</w:t>
-            </w:r>
-          </w:p>
-        </w:tc>
-        <w:tc>
-          <w:tcPr>
-            <w:tcW w:type="dxa" w:w="2946"/>
-          </w:tcPr>
-          <w:p>
-            <w:pPr>
-              <w:spacing w:after="40"/>
-            </w:pPr>
-            <w:r/>
-            <w:r>
-              <w:rPr>
-                <w:b w:val="0"/>
-                <w:i w:val="0"/>
-              </w:rPr>
-              <w:t>LiveLike</w:t>
+              <w:t>iFood</w:t>
             </w:r>
           </w:p>
         </w:tc>
@@ -3548,7 +3492,7 @@
           <w:b w:val="0"/>
           <w:i w:val="0"/>
         </w:rPr>
-        <w:t>Os segmentos abaixo devem estar disponíveis como audiências exportáveis no CMS da LiveLike todo dia até 7h (horário de Brasília):</w:t>
+        <w:t>Os segmentos devem ser passíveis de escolha, de acordo com configuração de evento, como audiências exportáveis através do servidor S3 da AWS todo dia até 7h BRT.</w:t>
       </w:r>
     </w:p>
     <w:p>
@@ -4178,233 +4122,6 @@
         <w:spacing w:after="40"/>
       </w:pPr>
     </w:p>
-    <w:p>
-      <w:pPr>
-        <w:pStyle w:val="Heading3"/>
-      </w:pPr>
-      <w:r>
-        <w:t>6.3 Eventos pontuais para comunicação em tempo real</w:t>
-      </w:r>
-    </w:p>
-    <w:p>
-      <w:r>
-        <w:rPr>
-          <w:b w:val="0"/>
-          <w:i w:val="0"/>
-        </w:rPr>
-        <w:t xml:space="preserve">Além das audiências diárias, precisamos de </w:t>
-      </w:r>
-      <w:r>
-        <w:rPr>
-          <w:b/>
-          <w:i w:val="0"/>
-        </w:rPr>
-        <w:t>webhooks ou triggers</w:t>
-      </w:r>
-      <w:r>
-        <w:rPr>
-          <w:b w:val="0"/>
-          <w:i w:val="0"/>
-        </w:rPr>
-        <w:t xml:space="preserve"> que disparem no momento do evento para comunicação imediata:</w:t>
-      </w:r>
-    </w:p>
-    <w:tbl>
-      <w:tblPr>
-        <w:tblStyle w:val="TableGrid"/>
-        <w:tblW w:type="auto" w:w="0"/>
-        <w:tblLook w:firstColumn="1" w:firstRow="1" w:lastColumn="0" w:lastRow="0" w:noHBand="0" w:noVBand="1" w:val="04A0"/>
-      </w:tblPr>
-      <w:tblGrid>
-        <w:gridCol w:w="2946"/>
-        <w:gridCol w:w="2946"/>
-        <w:gridCol w:w="2946"/>
-      </w:tblGrid>
-      <w:tr>
-        <w:tc>
-          <w:tcPr>
-            <w:tcW w:type="dxa" w:w="2946"/>
-            <w:shd w:val="clear" w:color="auto" w:fill="D6E4F0"/>
-          </w:tcPr>
-          <w:p>
-            <w:pPr>
-              <w:spacing w:after="40"/>
-            </w:pPr>
-            <w:r>
-              <w:rPr>
-                <w:b/>
-              </w:rPr>
-            </w:r>
-            <w:r>
-              <w:rPr>
-                <w:b/>
-                <w:i w:val="0"/>
-              </w:rPr>
-              <w:t>Evento</w:t>
-            </w:r>
-          </w:p>
-        </w:tc>
-        <w:tc>
-          <w:tcPr>
-            <w:tcW w:type="dxa" w:w="2946"/>
-            <w:shd w:val="clear" w:color="auto" w:fill="D6E4F0"/>
-          </w:tcPr>
-          <w:p>
-            <w:pPr>
-              <w:spacing w:after="40"/>
-            </w:pPr>
-            <w:r>
-              <w:rPr>
-                <w:b/>
-              </w:rPr>
-            </w:r>
-            <w:r>
-              <w:rPr>
-                <w:b/>
-                <w:i w:val="0"/>
-              </w:rPr>
-              <w:t>Trigger</w:t>
-            </w:r>
-          </w:p>
-        </w:tc>
-        <w:tc>
-          <w:tcPr>
-            <w:tcW w:type="dxa" w:w="2946"/>
-            <w:shd w:val="clear" w:color="auto" w:fill="D6E4F0"/>
-          </w:tcPr>
-          <w:p>
-            <w:pPr>
-              <w:spacing w:after="40"/>
-            </w:pPr>
-            <w:r>
-              <w:rPr>
-                <w:b/>
-              </w:rPr>
-            </w:r>
-            <w:r>
-              <w:rPr>
-                <w:b/>
-                <w:i w:val="0"/>
-              </w:rPr>
-              <w:t>Canal sugerido</w:t>
-            </w:r>
-          </w:p>
-        </w:tc>
-      </w:tr>
-      <w:tr>
-        <w:tc>
-          <w:tcPr>
-            <w:tcW w:type="dxa" w:w="2946"/>
-          </w:tcPr>
-          <w:p>
-            <w:pPr>
-              <w:spacing w:after="40"/>
-            </w:pPr>
-            <w:r/>
-            <w:r>
-              <w:rPr>
-                <w:b w:val="0"/>
-                <w:i w:val="0"/>
-              </w:rPr>
-              <w:t>Usuário entrou no top 1.000</w:t>
-            </w:r>
-          </w:p>
-        </w:tc>
-        <w:tc>
-          <w:tcPr>
-            <w:tcW w:type="dxa" w:w="2946"/>
-          </w:tcPr>
-          <w:p>
-            <w:pPr>
-              <w:spacing w:after="40"/>
-            </w:pPr>
-            <w:r/>
-            <w:r>
-              <w:rPr>
-                <w:b w:val="0"/>
-                <w:i w:val="0"/>
-              </w:rPr>
-              <w:t>Imediato</w:t>
-            </w:r>
-          </w:p>
-        </w:tc>
-        <w:tc>
-          <w:tcPr>
-            <w:tcW w:type="dxa" w:w="2946"/>
-          </w:tcPr>
-          <w:p>
-            <w:pPr>
-              <w:spacing w:after="40"/>
-            </w:pPr>
-            <w:r/>
-            <w:r>
-              <w:rPr>
-                <w:b w:val="0"/>
-                <w:i w:val="0"/>
-              </w:rPr>
-              <w:t>Push</w:t>
-            </w:r>
-          </w:p>
-        </w:tc>
-      </w:tr>
-      <w:tr>
-        <w:tc>
-          <w:tcPr>
-            <w:tcW w:type="dxa" w:w="2946"/>
-          </w:tcPr>
-          <w:p>
-            <w:pPr>
-              <w:spacing w:after="40"/>
-            </w:pPr>
-            <w:r/>
-            <w:r>
-              <w:rPr>
-                <w:b w:val="0"/>
-                <w:i w:val="0"/>
-              </w:rPr>
-              <w:t>Usuário entrou no top 100</w:t>
-            </w:r>
-          </w:p>
-        </w:tc>
-        <w:tc>
-          <w:tcPr>
-            <w:tcW w:type="dxa" w:w="2946"/>
-          </w:tcPr>
-          <w:p>
-            <w:pPr>
-              <w:spacing w:after="40"/>
-            </w:pPr>
-            <w:r/>
-            <w:r>
-              <w:rPr>
-                <w:b w:val="0"/>
-                <w:i w:val="0"/>
-              </w:rPr>
-              <w:t>Imediato</w:t>
-            </w:r>
-          </w:p>
-        </w:tc>
-        <w:tc>
-          <w:tcPr>
-            <w:tcW w:type="dxa" w:w="2946"/>
-          </w:tcPr>
-          <w:p>
-            <w:pPr>
-              <w:spacing w:after="40"/>
-            </w:pPr>
-            <w:r/>
-            <w:r>
-              <w:rPr>
-                <w:b w:val="0"/>
-                <w:i w:val="0"/>
-              </w:rPr>
-              <w:t>Push</w:t>
-            </w:r>
-          </w:p>
-        </w:tc>
-      </w:tr>
-    </w:tbl>
-    <w:p/>
     <w:p>
       <w:pPr>
         <w:spacing w:after="40"/>
@@ -5842,18 +5559,6 @@
           <w:b w:val="0"/>
           <w:i w:val="0"/>
         </w:rPr>
-        <w:t>Acesso: CazéTV (equipe de operações e transmissão)</w:t>
-      </w:r>
-    </w:p>
-    <w:p>
-      <w:pPr>
-        <w:pStyle w:val="ListBullet"/>
-      </w:pPr>
-      <w:r>
-        <w:rPr>
-          <w:b w:val="0"/>
-          <w:i w:val="0"/>
-        </w:rPr>
         <w:t>Atualização: a cada 1 minuto</w:t>
       </w:r>
     </w:p>
@@ -5887,18 +5592,6 @@
           <w:b w:val="0"/>
           <w:i w:val="0"/>
         </w:rPr>
-        <w:t>Acesso: CazéTV (produto, marketing, dados)</w:t>
-      </w:r>
-    </w:p>
-    <w:p>
-      <w:pPr>
-        <w:pStyle w:val="ListBullet"/>
-      </w:pPr>
-      <w:r>
-        <w:rPr>
-          <w:b w:val="0"/>
-          <w:i w:val="0"/>
-        </w:rPr>
         <w:t>Atualização: diária (até 7h)</w:t>
       </w:r>
     </w:p>
@@ -5921,18 +5614,6 @@
           <w:i w:val="0"/>
         </w:rPr>
         <w:t>Dashboard 3 — Funil de Conversão</w:t>
-      </w:r>
-    </w:p>
-    <w:p>
-      <w:pPr>
-        <w:pStyle w:val="ListBullet"/>
-      </w:pPr>
-      <w:r>
-        <w:rPr>
-          <w:b w:val="0"/>
-          <w:i w:val="0"/>
-        </w:rPr>
-        <w:t>Acesso: CazéTV + iFood</w:t>
       </w:r>
     </w:p>
     <w:p>
@@ -5983,7 +5664,7 @@
           <w:b w:val="0"/>
           <w:i w:val="0"/>
         </w:rPr>
-        <w:t xml:space="preserve"> CSV ou JSON com os campos da seção 6.1</w:t>
+        <w:t xml:space="preserve"> CSV ou JSON com os campos da seção 6.1, disponibilizados para o iFood via servidor S3 da AWS</w:t>
       </w:r>
     </w:p>
     <w:p>
@@ -6002,64 +5683,7 @@
           <w:b w:val="0"/>
           <w:i w:val="0"/>
         </w:rPr>
-        <w:t xml:space="preserve"> diária, até 7h (horário de Brasília), ou sob demanda via API</w:t>
-      </w:r>
-    </w:p>
-    <w:p>
-      <w:pPr>
-        <w:pStyle w:val="ListBullet"/>
-      </w:pPr>
-      <w:r>
-        <w:rPr>
-          <w:b/>
-          <w:i w:val="0"/>
-        </w:rPr>
-        <w:t>Método de entrega:</w:t>
-      </w:r>
-      <w:r>
-        <w:rPr>
-          <w:b w:val="0"/>
-          <w:i w:val="0"/>
-        </w:rPr>
-        <w:t xml:space="preserve"> endpoint de API REST autenticado ou SFTP</w:t>
-      </w:r>
-    </w:p>
-    <w:p>
-      <w:pPr>
-        <w:pStyle w:val="ListBullet"/>
-      </w:pPr>
-      <w:r>
-        <w:rPr>
-          <w:b/>
-          <w:i w:val="0"/>
-        </w:rPr>
-        <w:t>Identificador de reconciliação:</w:t>
-      </w:r>
-      <w:r>
-        <w:rPr>
-          <w:b w:val="0"/>
-          <w:i w:val="0"/>
-        </w:rPr>
-        <w:t xml:space="preserve"> hash do CPF (SHA-256) para cruzamento com base iFood/CazéTV</w:t>
-      </w:r>
-    </w:p>
-    <w:p>
-      <w:pPr>
-        <w:pStyle w:val="ListBullet"/>
-      </w:pPr>
-      <w:r>
-        <w:rPr>
-          <w:b/>
-          <w:i w:val="0"/>
-        </w:rPr>
-        <w:t>Retenção:</w:t>
-      </w:r>
-      <w:r>
-        <w:rPr>
-          <w:b w:val="0"/>
-          <w:i w:val="0"/>
-        </w:rPr>
-        <w:t xml:space="preserve"> dados de audiência disponíveis por até 30 dias</w:t>
+        <w:t xml:space="preserve"> diária, até 7h BRT, ou sob demanda</w:t>
       </w:r>
     </w:p>
     <w:p>
@@ -6067,75 +5691,7 @@
         <w:pStyle w:val="Heading3"/>
       </w:pPr>
       <w:r>
-        <w:t>8.3 Webhooks para eventos em tempo real</w:t>
-      </w:r>
-    </w:p>
-    <w:p>
-      <w:pPr>
-        <w:pStyle w:val="ListBullet"/>
-      </w:pPr>
-      <w:r>
-        <w:rPr>
-          <w:b w:val="0"/>
-          <w:i w:val="0"/>
-        </w:rPr>
-        <w:t>Protocolo: HTTPS POST para endpoint da CazéTV/iFood</w:t>
-      </w:r>
-    </w:p>
-    <w:p>
-      <w:pPr>
-        <w:pStyle w:val="ListBullet"/>
-      </w:pPr>
-      <w:r>
-        <w:rPr>
-          <w:b w:val="0"/>
-          <w:i w:val="0"/>
-        </w:rPr>
-        <w:t>Autenticação: Bearer token</w:t>
-      </w:r>
-    </w:p>
-    <w:p>
-      <w:pPr>
-        <w:pStyle w:val="ListBullet"/>
-      </w:pPr>
-      <w:r>
-        <w:rPr>
-          <w:b w:val="0"/>
-          <w:i w:val="0"/>
-        </w:rPr>
-        <w:t>Payload mínimo: user_id, event_type, timestamp, atributos relevantes do evento</w:t>
-      </w:r>
-    </w:p>
-    <w:p>
-      <w:pPr>
-        <w:pStyle w:val="ListBullet"/>
-      </w:pPr>
-      <w:r>
-        <w:rPr>
-          <w:b w:val="0"/>
-          <w:i w:val="0"/>
-        </w:rPr>
-        <w:t>SLA: entrega em até 30 segundos do evento</w:t>
-      </w:r>
-    </w:p>
-    <w:p>
-      <w:pPr>
-        <w:pStyle w:val="ListBullet"/>
-      </w:pPr>
-      <w:r>
-        <w:rPr>
-          <w:b w:val="0"/>
-          <w:i w:val="0"/>
-        </w:rPr>
-        <w:t>Retry: 3 tentativas com backoff exponencial</w:t>
-      </w:r>
-    </w:p>
-    <w:p>
-      <w:pPr>
-        <w:pStyle w:val="Heading3"/>
-      </w:pPr>
-      <w:r>
-        <w:t>8.4 Reconciliação de dados iFood ↔ LiveLike</w:t>
+        <w:t>8.3 Reconciliação de dados iFood ↔ LiveLike</w:t>
       </w:r>
     </w:p>
     <w:p>

</xml_diff>